<commit_message>
Corregir informe TP2: quitar aclaraciones redundantes y arreglar figuras trocadas
- Se sacaron tres frases estilo aclaracion conversacional que no aportaban
  al informe tecnico ("la conectividad geometrica no debe confundirse...",
  "el color codifica la orientacion de la velocidad" x2, "los cruces
  locales... no deben interpretarse como una inversion robusta").
- Se corrigio un error de origen en el .docx (ya presente antes de esta
  tarea): las Figuras 3, 4 y 7 tenian las imagenes permutadas entre si
  (Fig.3 mostraba lo que correspondia a Fig.7, etc.), aunque el texto y
  los captions siempre fueron correctos. Se reordenaron los bytes de las
  tres imagenes (en el docx via zip, en el .tex via figs/) sin tocar
  texto ni captions. Recompilado y verificado pagina por pagina con
  tectonic.

Co-Authored-By: Claude Sonnet 5 <noreply@anthropic.com>
</commit_message>
<xml_diff>
--- a/Informe TP2.docx
+++ b/Informe TP2.docx
@@ -1497,34 +1497,33 @@
           <w:iCs w:val="1"/>
           <w:rtl w:val="0"/>
         </w:rPr>
-        <w:t xml:space="preserve">Figura 1: Configuraciones del modelo de Vicsek para rho = 2 y t = 2000. Panel izquierdo: η = 1. Panel derecho: η = 5. El color codifica la orientación de la velocidad</w:t>
-      </w:r>
-      <w:r>
-        <w:rPr>
-          <w:rtl w:val="0"/>
-        </w:rPr>
-        <w:t xml:space="preserve">.</w:t>
-      </w:r>
-    </w:p>
-    <w:p>
-      <w:pPr>
-        <w:rPr/>
-      </w:pPr>
-      <w:r>
-        <w:rPr>
-          <w:rtl w:val="0"/>
-        </w:rPr>
-      </w:r>
-    </w:p>
-    <w:p>
-      <w:pPr>
-        <w:rPr/>
-      </w:pPr>
-      <w:r>
-        <w:rPr>
-          <w:rtl w:val="0"/>
-        </w:rPr>
-        <w:t xml:space="preserve">La conectividad geométrica no debe confundirse con el orden direccional. El observable S, definido como la fracción de partículas de la componente conexa más grande, puede ser alto incluso cuando v_a es bajo: un conjunto puede permanecer conectado espacialmente y, al mismo tiempo, tener direcciones desordenadas. El análisis específico de S se presenta en la sección de clusters.</w:t>
+        <w:t>Figura 1: Configuraciones del modelo de Vicsek para rho = 2 y t = 2000. Panel izquierdo: η = 1. Panel derecho: η = 5.</w:t>
+      </w:r>
+      <w:r>
+        <w:rPr>
+          <w:rtl w:val="0"/>
+        </w:rPr>
+      </w:r>
+    </w:p>
+    <w:p>
+      <w:pPr>
+        <w:rPr/>
+      </w:pPr>
+      <w:r>
+        <w:rPr>
+          <w:rtl w:val="0"/>
+        </w:rPr>
+      </w:r>
+    </w:p>
+    <w:p>
+      <w:pPr>
+        <w:rPr/>
+      </w:pPr>
+      <w:r>
+        <w:rPr>
+          <w:rtl w:val="0"/>
+        </w:rPr>
+        <w:t>El observable S, definido como la fracción de partículas de la componente conexa más grande, se presenta en la sección de clusters.</w:t>
       </w:r>
     </w:p>
     <w:p>
@@ -1662,7 +1661,7 @@
         <w:rPr>
           <w:rtl w:val="0"/>
         </w:rPr>
-        <w:t xml:space="preserve"> para las tres densidades. En todos los casos, la polarización disminuye al aumentar η. Además, en la mayor parte del intervalo de ruido, las densidades más altas conservan una polarización mayor. Este resultado es consistente con la regla de Vicsek: al aumentar la cantidad de vecinos, el promedio vectorial integra más direcciones y atenúa las fluctuaciones individuales. Para ruido alto, todas las curvas convergen a valores bajos y las diferencias entre densidades pierden relevancia; los cruces locales en esa zona no deben interpretarse como una inversión robusta de la tendencia.</w:t>
+        <w:t xml:space="preserve"> para las tres densidades. En todos los casos, la polarización disminuye al aumentar η. Además, en la mayor parte del intervalo de ruido, las densidades más altas conservan una polarización mayor. Este resultado es consistente con la regla de Vicsek: al aumentar la cantidad de vecinos, el promedio vectorial integra más direcciones y atenúa las fluctuaciones individuales. Para ruido alto, todas las curvas convergen a valores bajos y las diferencias entre densidades pierden relevancia.</w:t>
       </w:r>
     </w:p>
     <w:p>
@@ -1872,7 +1871,7 @@
           <w:iCs w:val="1"/>
           <w:rtl w:val="0"/>
         </w:rPr>
-        <w:t xml:space="preserve">Figura 4: Configuraciones del modelo de votante para rho = 2 y t = 2000. Panel izquierdo: η = 0.1 y v_a(t) = 0.973. Panel derecho: η = 1 y v_a(t) = 0.354. El color codifica la orientación de la velocidad.</w:t>
+        <w:t>Figura 4: Configuraciones del modelo de votante para rho = 2 y t = 2000. Panel izquierdo: η = 0.1 y v_a(t) = 0.973. Panel derecho: η = 1 y v_a(t) = 0.354.</w:t>
       </w:r>
       <w:r>
         <w:rPr>

</xml_diff>